<commit_message>
ci(public): deploy docroot and smoke-check public resources path
</commit_message>
<xml_diff>
--- a/docs/systems_administration.docx
+++ b/docs/systems_administration.docx
@@ -18,61 +18,184 @@
       </w:r>
     </w:p>
     <w:p>
-      <w:r>
-        <w:t># 1) Generate artifacts locally (source-of-truth under /assets/)</w:t>
-      </w:r>
-    </w:p>
-    <w:p>
+      <w:pPr>
+        <w:spacing w:after="0" w:line="240" w:lineRule="auto"/>
+      </w:pPr>
+      <w:r>
+        <w:t># (re)generate beginner artifacts (CSV/PNG)</w:t>
+      </w:r>
+    </w:p>
+    <w:p>
+      <w:pPr>
+        <w:spacing w:after="0" w:line="240" w:lineRule="auto"/>
+      </w:pPr>
       <w:r>
         <w:t>bash tools/export_all_beginners.sh</w:t>
       </w:r>
     </w:p>
+    <w:p>
+      <w:pPr>
+        <w:spacing w:after="0" w:line="240" w:lineRule="auto"/>
+      </w:pPr>
+    </w:p>
+    <w:p>
+      <w:pPr>
+        <w:spacing w:after="0" w:line="240" w:lineRule="auto"/>
+      </w:pPr>
+      <w:r>
+        <w:t xml:space="preserve"># </w:t>
+      </w:r>
+      <w:proofErr w:type="gramStart"/>
+      <w:r>
+        <w:t>mirror</w:t>
+      </w:r>
+      <w:proofErr w:type="gramEnd"/>
+      <w:r>
+        <w:t xml:space="preserve"> all lab artifacts (CSV/PNG/HTML) into the web tree</w:t>
+      </w:r>
+    </w:p>
+    <w:p>
+      <w:pPr>
+        <w:spacing w:after="0" w:line="240" w:lineRule="auto"/>
+      </w:pPr>
+      <w:r>
+        <w:t>bash tools/sync_public_assets.sh</w:t>
+      </w:r>
+    </w:p>
+    <w:p>
+      <w:pPr>
+        <w:spacing w:after="0" w:line="240" w:lineRule="auto"/>
+      </w:pPr>
+    </w:p>
+    <w:p>
+      <w:pPr>
+        <w:spacing w:after="0" w:line="240" w:lineRule="auto"/>
+      </w:pPr>
+      <w:r>
+        <w:t># commit &amp; push to trigger deploy (if desired)</w:t>
+      </w:r>
+    </w:p>
+    <w:p>
+      <w:pPr>
+        <w:spacing w:after="0" w:line="240" w:lineRule="auto"/>
+      </w:pPr>
+      <w:r>
+        <w:t>git add -A</w:t>
+      </w:r>
+    </w:p>
+    <w:p>
+      <w:pPr>
+        <w:spacing w:after="0" w:line="240" w:lineRule="auto"/>
+      </w:pPr>
+      <w:r>
+        <w:t>git commit -m "chore(public): sync lab artifacts (data/images/html) to web tree"</w:t>
+      </w:r>
+    </w:p>
+    <w:p>
+      <w:pPr>
+        <w:spacing w:after="0" w:line="240" w:lineRule="auto"/>
+      </w:pPr>
+      <w:r>
+        <w:t>git push</w:t>
+      </w:r>
+    </w:p>
     <w:p/>
     <w:p>
       <w:r>
-        <w:t># 2) Mirror into web tree for publication</w:t>
-      </w:r>
-    </w:p>
-    <w:p>
-      <w:r>
-        <w:t>bash tools/sync_public_assets.sh</w:t>
+        <w:t>This keeps your current /home/quscitech/public_html/instructors/QST-INST-2025/resources/hello-ci.html untouched, and publishes all lab artifacts neatly under:</w:t>
+      </w:r>
+    </w:p>
+    <w:p>
+      <w:r>
+        <w:t>/home/quscitech/public_html/instructors/QST-INST-2025/resources/labs/&lt;lab&gt;/{data,images}</w:t>
+      </w:r>
+    </w:p>
+    <w:p>
+      <w:r>
+        <w:t>------------</w:t>
+      </w:r>
+    </w:p>
+    <w:p>
+      <w:pPr>
+        <w:rPr>
+          <w:b/>
+          <w:bCs/>
+        </w:rPr>
+      </w:pPr>
+      <w:r>
+        <w:rPr>
+          <w:b/>
+          <w:bCs/>
+        </w:rPr>
+        <w:t>Make it executable</w:t>
+      </w:r>
+    </w:p>
+    <w:p>
+      <w:r>
+        <w:t>From repo root in Git Bash:</w:t>
+      </w:r>
+    </w:p>
+    <w:p>
+      <w:proofErr w:type="spellStart"/>
+      <w:r>
+        <w:t>chmod</w:t>
+      </w:r>
+      <w:proofErr w:type="spellEnd"/>
+      <w:r>
+        <w:t xml:space="preserve"> +x tools/sync_public_assets.sh</w:t>
       </w:r>
     </w:p>
     <w:p/>
     <w:p>
       <w:r>
-        <w:t># 3) Commit &amp; push to kick CI deploy</w:t>
-      </w:r>
-    </w:p>
-    <w:p>
-      <w:r>
-        <w:t>git add -A</w:t>
-      </w:r>
-    </w:p>
-    <w:p>
-      <w:r>
-        <w:t>git commit -m "chore(public): update exported artifacts"</w:t>
-      </w:r>
-    </w:p>
-    <w:p>
-      <w:r>
-        <w:t>git push</w:t>
-      </w:r>
-    </w:p>
-    <w:p/>
-    <w:p>
-      <w:r>
-        <w:t>This keeps your current /home/quscitech/public_html/instructors/QST-INST-2025/resources/hello-ci.html untouched, and publishes all lab artifacts neatly under:</w:t>
-      </w:r>
-    </w:p>
-    <w:p>
-      <w:r>
-        <w:t>/home/quscitech/public_html/instructors/QST-INST-2025/resources/labs/&lt;lab&gt;/{data,images}</w:t>
-      </w:r>
-    </w:p>
-    <w:p>
-      <w:r>
-        <w:t>------------</w:t>
+        <w:t>------------------</w:t>
+      </w:r>
+    </w:p>
+    <w:p>
+      <w:r>
+        <w:t xml:space="preserve"># </w:t>
+      </w:r>
+      <w:proofErr w:type="gramStart"/>
+      <w:r>
+        <w:t>replace</w:t>
+      </w:r>
+      <w:proofErr w:type="gramEnd"/>
+      <w:r>
+        <w:t xml:space="preserve"> with your server IP if you want to bypass any DNS/CDN caches</w:t>
+      </w:r>
+    </w:p>
+    <w:p>
+      <w:r>
+        <w:t>VPS_IP="</w:t>
+      </w:r>
+      <w:r>
+        <w:t>37.148.203.89</w:t>
+      </w:r>
+      <w:r>
+        <w:t>"</w:t>
+      </w:r>
+    </w:p>
+    <w:p>
+      <w:r>
+        <w:t>curl -</w:t>
+      </w:r>
+      <w:proofErr w:type="spellStart"/>
+      <w:r>
+        <w:t>fsSIL</w:t>
+      </w:r>
+      <w:proofErr w:type="spellEnd"/>
+      <w:r>
+        <w:t xml:space="preserve"> --resolve "quscitech.com:443:${VPS_IP}" \</w:t>
+      </w:r>
+    </w:p>
+    <w:p>
+      <w:r>
+        <w:t xml:space="preserve">  "https://quscitech.com/instructors/QST-INST-2025/resources/hello-ci.html" \</w:t>
+      </w:r>
+    </w:p>
+    <w:p>
+      <w:r>
+        <w:t xml:space="preserve">  &amp;&amp; echo "OK" || echo "MISSING"</w:t>
       </w:r>
     </w:p>
     <w:sectPr>

</xml_diff>